<commit_message>
Add ECGI Brazil blog post to media list and CV
Co-Authored-By: Claude Opus 4.7 (1M context) <noreply@anthropic.com>
</commit_message>
<xml_diff>
--- a/Yifat Aran CV 2026 March 15.docx
+++ b/Yifat Aran CV 2026 March 15.docx
@@ -2012,6 +2012,52 @@
           <w:color w:val="000000" w:themeColor="text1"/>
         </w:rPr>
         <w:t>, Oxford Business Law Blog (January 2026).</w:t>
+      </w:r>
+    </w:p>
+    <w:p>
+      <w:pPr>
+        <w:pStyle w:val="ListParagraph"/>
+        <w:numPr>
+          <w:ilvl w:val="0"/>
+          <w:numId w:val="4"/>
+        </w:numPr>
+        <w:spacing w:after="80"/>
+        <w:rPr>
+          <w:rFonts w:ascii="Garamond" w:hAnsi="Garamond"/>
+          <w:color w:val="000000" w:themeColor="text1"/>
+        </w:rPr>
+      </w:pPr>
+      <w:r>
+        <w:rPr>
+          <w:rFonts w:ascii="Garamond" w:hAnsi="Garamond"/>
+          <w:b/>
+          <w:bCs/>
+          <w:color w:val="000000" w:themeColor="text1"/>
+        </w:rPr>
+        <w:t>Yifat Aran</w:t>
+      </w:r>
+      <w:r>
+        <w:rPr>
+          <w:rFonts w:ascii="Garamond" w:hAnsi="Garamond"/>
+          <w:color w:val="000000" w:themeColor="text1"/>
+        </w:rPr>
+        <w:t xml:space="preserve">, </w:t>
+      </w:r>
+      <w:r>
+        <w:rPr>
+          <w:rFonts w:ascii="Garamond" w:hAnsi="Garamond"/>
+          <w:i/>
+          <w:iCs/>
+          <w:color w:val="000000" w:themeColor="text1"/>
+        </w:rPr>
+        <w:t>What Brazil Reveals About the Limits of Venture Capital Contract Transplants</w:t>
+      </w:r>
+      <w:r>
+        <w:rPr>
+          <w:rFonts w:ascii="Garamond" w:hAnsi="Garamond"/>
+          <w:color w:val="000000" w:themeColor="text1"/>
+        </w:rPr>
+        <w:t>, ECGI Blog (April 27, 2026).</w:t>
       </w:r>
     </w:p>
     <w:p>

</xml_diff>